<commit_message>
beginning of the great shinylive overhaul
</commit_message>
<xml_diff>
--- a/docs/answers/as-addandsm.docx
+++ b/docs/answers/as-addandsm.docx
@@ -52,7 +52,7 @@
         </w:rPr>
         <w:t xml:space="preserve"> </w:t>
       </w:r>
-      <w:hyperlink r:id="rId20">
+      <w:hyperlink r:id="rId9">
         <w:r>
           <w:rPr>
             <w:rStyle w:val="Hyperlink"/>
@@ -82,7 +82,7 @@
         <w:t xml:space="preserve">Please attempt the questions before reading these answers!</w:t>
       </w:r>
     </w:p>
-    <w:bookmarkStart w:id="21" w:name="q1"/>
+    <w:bookmarkStart w:id="10" w:name="q1"/>
     <w:p>
       <w:pPr>
         <w:pStyle w:val="Heading2"/>
@@ -503,28 +503,30 @@
           </m:rPr>
           <m:t>−</m:t>
         </m:r>
-        <m:d>
-          <m:dPr>
-            <m:begChr m:val="("/>
-            <m:sepChr m:val=""/>
-            <m:endChr m:val=")"/>
-            <m:grow/>
-          </m:dPr>
-          <m:e>
-            <m:r>
-              <m:t>3</m:t>
-            </m:r>
-            <m:r>
-              <m:rPr>
-                <m:sty m:val="p"/>
-              </m:rPr>
-              <m:t>+</m:t>
-            </m:r>
-            <m:r>
-              <m:t>11</m:t>
-            </m:r>
-          </m:e>
-        </m:d>
+        <m:r>
+          <m:rPr>
+            <m:sty m:val="p"/>
+          </m:rPr>
+          <m:t>(</m:t>
+        </m:r>
+        <m:r>
+          <m:t>3</m:t>
+        </m:r>
+        <m:r>
+          <m:rPr>
+            <m:sty m:val="p"/>
+          </m:rPr>
+          <m:t>+</m:t>
+        </m:r>
+        <m:r>
+          <m:t>11</m:t>
+        </m:r>
+        <m:r>
+          <m:rPr>
+            <m:sty m:val="p"/>
+          </m:rPr>
+          <m:t>)</m:t>
+        </m:r>
         <m:r>
           <m:rPr>
             <m:sty m:val="p"/>
@@ -574,34 +576,36 @@
           </m:rPr>
           <m:t>−</m:t>
         </m:r>
-        <m:d>
-          <m:dPr>
-            <m:begChr m:val="("/>
-            <m:sepChr m:val=""/>
-            <m:endChr m:val=")"/>
-            <m:grow/>
-          </m:dPr>
-          <m:e>
-            <m:r>
-              <m:rPr>
-                <m:sty m:val="p"/>
-              </m:rPr>
-              <m:t>−</m:t>
-            </m:r>
-            <m:r>
-              <m:t>3</m:t>
-            </m:r>
-            <m:r>
-              <m:rPr>
-                <m:sty m:val="p"/>
-              </m:rPr>
-              <m:t>−</m:t>
-            </m:r>
-            <m:r>
-              <m:t>4</m:t>
-            </m:r>
-          </m:e>
-        </m:d>
+        <m:r>
+          <m:rPr>
+            <m:sty m:val="p"/>
+          </m:rPr>
+          <m:t>(</m:t>
+        </m:r>
+        <m:r>
+          <m:rPr>
+            <m:sty m:val="p"/>
+          </m:rPr>
+          <m:t>−</m:t>
+        </m:r>
+        <m:r>
+          <m:t>3</m:t>
+        </m:r>
+        <m:r>
+          <m:rPr>
+            <m:sty m:val="p"/>
+          </m:rPr>
+          <m:t>−</m:t>
+        </m:r>
+        <m:r>
+          <m:t>4</m:t>
+        </m:r>
+        <m:r>
+          <m:rPr>
+            <m:sty m:val="p"/>
+          </m:rPr>
+          <m:t>)</m:t>
+        </m:r>
         <m:r>
           <m:rPr>
             <m:sty m:val="p"/>
@@ -651,34 +655,36 @@
           </m:rPr>
           <m:t>−</m:t>
         </m:r>
-        <m:d>
-          <m:dPr>
-            <m:begChr m:val="("/>
-            <m:sepChr m:val=""/>
-            <m:endChr m:val=")"/>
-            <m:grow/>
-          </m:dPr>
-          <m:e>
-            <m:r>
-              <m:rPr>
-                <m:sty m:val="p"/>
-              </m:rPr>
-              <m:t>−</m:t>
-            </m:r>
-            <m:r>
-              <m:t>2</m:t>
-            </m:r>
-            <m:r>
-              <m:rPr>
-                <m:sty m:val="p"/>
-              </m:rPr>
-              <m:t>+</m:t>
-            </m:r>
-            <m:r>
-              <m:t>9</m:t>
-            </m:r>
-          </m:e>
-        </m:d>
+        <m:r>
+          <m:rPr>
+            <m:sty m:val="p"/>
+          </m:rPr>
+          <m:t>(</m:t>
+        </m:r>
+        <m:r>
+          <m:rPr>
+            <m:sty m:val="p"/>
+          </m:rPr>
+          <m:t>−</m:t>
+        </m:r>
+        <m:r>
+          <m:t>2</m:t>
+        </m:r>
+        <m:r>
+          <m:rPr>
+            <m:sty m:val="p"/>
+          </m:rPr>
+          <m:t>+</m:t>
+        </m:r>
+        <m:r>
+          <m:t>9</m:t>
+        </m:r>
+        <m:r>
+          <m:rPr>
+            <m:sty m:val="p"/>
+          </m:rPr>
+          <m:t>)</m:t>
+        </m:r>
         <m:r>
           <m:rPr>
             <m:sty m:val="p"/>
@@ -752,8 +758,8 @@
         <w:t xml:space="preserve">.</w:t>
       </w:r>
     </w:p>
-    <w:bookmarkEnd w:id="21"/>
-    <w:bookmarkStart w:id="22" w:name="q2"/>
+    <w:bookmarkEnd w:id="10"/>
+    <w:bookmarkStart w:id="11" w:name="q2"/>
     <w:p>
       <w:pPr>
         <w:pStyle w:val="Heading2"/>
@@ -1089,8 +1095,8 @@
         <w:t xml:space="preserve">.</w:t>
       </w:r>
     </w:p>
-    <w:bookmarkEnd w:id="22"/>
-    <w:bookmarkStart w:id="23" w:name="q3"/>
+    <w:bookmarkEnd w:id="11"/>
+    <w:bookmarkStart w:id="12" w:name="q3"/>
     <w:p>
       <w:pPr>
         <w:pStyle w:val="Heading2"/>
@@ -1125,19 +1131,21 @@
           </m:rPr>
           <m:t>=</m:t>
         </m:r>
-        <m:d>
-          <m:dPr>
-            <m:begChr m:val="("/>
-            <m:sepChr m:val=""/>
-            <m:endChr m:val=")"/>
-            <m:grow/>
-          </m:dPr>
-          <m:e>
-            <m:r>
-              <m:t>3</m:t>
-            </m:r>
-          </m:e>
-        </m:d>
+        <m:r>
+          <m:rPr>
+            <m:sty m:val="p"/>
+          </m:rPr>
+          <m:t>(</m:t>
+        </m:r>
+        <m:r>
+          <m:t>3</m:t>
+        </m:r>
+        <m:r>
+          <m:rPr>
+            <m:sty m:val="p"/>
+          </m:rPr>
+          <m:t>)</m:t>
+        </m:r>
         <m:r>
           <m:t>5</m:t>
         </m:r>
@@ -1153,19 +1161,21 @@
           </m:rPr>
           <m:t>+</m:t>
         </m:r>
-        <m:d>
-          <m:dPr>
-            <m:begChr m:val="("/>
-            <m:sepChr m:val=""/>
-            <m:endChr m:val=")"/>
-            <m:grow/>
-          </m:dPr>
-          <m:e>
-            <m:r>
-              <m:t>3</m:t>
-            </m:r>
-          </m:e>
-        </m:d>
+        <m:r>
+          <m:rPr>
+            <m:sty m:val="p"/>
+          </m:rPr>
+          <m:t>(</m:t>
+        </m:r>
+        <m:r>
+          <m:t>3</m:t>
+        </m:r>
+        <m:r>
+          <m:rPr>
+            <m:sty m:val="p"/>
+          </m:rPr>
+          <m:t>)</m:t>
+        </m:r>
         <m:r>
           <m:t>6</m:t>
         </m:r>
@@ -1424,40 +1434,42 @@
           </m:rPr>
           <m:t>−</m:t>
         </m:r>
-        <m:d>
-          <m:dPr>
-            <m:begChr m:val="("/>
-            <m:sepChr m:val=""/>
-            <m:endChr m:val=")"/>
-            <m:grow/>
-          </m:dPr>
-          <m:e>
-            <m:r>
-              <m:t>4</m:t>
-            </m:r>
-            <m:r>
-              <m:rPr>
-                <m:sty m:val="b"/>
-              </m:rPr>
-              <m:t>u</m:t>
-            </m:r>
-            <m:r>
-              <m:rPr>
-                <m:sty m:val="p"/>
-              </m:rPr>
-              <m:t>−</m:t>
-            </m:r>
-            <m:r>
-              <m:t>2</m:t>
-            </m:r>
-            <m:r>
-              <m:rPr>
-                <m:sty m:val="b"/>
-              </m:rPr>
-              <m:t>v</m:t>
-            </m:r>
-          </m:e>
-        </m:d>
+        <m:r>
+          <m:rPr>
+            <m:sty m:val="p"/>
+          </m:rPr>
+          <m:t>(</m:t>
+        </m:r>
+        <m:r>
+          <m:t>4</m:t>
+        </m:r>
+        <m:r>
+          <m:rPr>
+            <m:sty m:val="b"/>
+          </m:rPr>
+          <m:t>u</m:t>
+        </m:r>
+        <m:r>
+          <m:rPr>
+            <m:sty m:val="p"/>
+          </m:rPr>
+          <m:t>−</m:t>
+        </m:r>
+        <m:r>
+          <m:t>2</m:t>
+        </m:r>
+        <m:r>
+          <m:rPr>
+            <m:sty m:val="b"/>
+          </m:rPr>
+          <m:t>v</m:t>
+        </m:r>
+        <m:r>
+          <m:rPr>
+            <m:sty m:val="p"/>
+          </m:rPr>
+          <m:t>)</m:t>
+        </m:r>
         <m:r>
           <m:rPr>
             <m:sty m:val="p"/>
@@ -1529,8 +1541,8 @@
         </m:d>
       </m:oMath>
     </w:p>
-    <w:bookmarkEnd w:id="23"/>
-    <w:bookmarkStart w:id="24" w:name="q4"/>
+    <w:bookmarkEnd w:id="12"/>
+    <w:bookmarkStart w:id="13" w:name="q4"/>
     <w:p>
       <w:pPr>
         <w:pStyle w:val="Heading2"/>
@@ -2684,49 +2696,51 @@
           </m:rPr>
           <m:t>=</m:t>
         </m:r>
-        <m:d>
-          <m:dPr>
-            <m:begChr m:val="("/>
-            <m:sepChr m:val=""/>
-            <m:endChr m:val=")"/>
-            <m:grow/>
-          </m:dPr>
-          <m:e>
-            <m:r>
-              <m:rPr>
-                <m:sty m:val="p"/>
-              </m:rPr>
-              <m:t>−</m:t>
-            </m:r>
-            <m:r>
-              <m:t>5</m:t>
-            </m:r>
-            <m:r>
-              <m:rPr>
-                <m:sty m:val="p"/>
-              </m:rPr>
-              <m:t>,</m:t>
-            </m:r>
-            <m:r>
-              <m:rPr>
-                <m:sty m:val="p"/>
-              </m:rPr>
-              <m:t>−</m:t>
-            </m:r>
-            <m:r>
-              <m:t>2</m:t>
-            </m:r>
-            <m:r>
-              <m:rPr>
-                <m:sty m:val="p"/>
-              </m:rPr>
-              <m:t>,</m:t>
-            </m:r>
-            <m:r>
-              <m:t>11</m:t>
-            </m:r>
-          </m:e>
-        </m:d>
+        <m:r>
+          <m:rPr>
+            <m:sty m:val="p"/>
+          </m:rPr>
+          <m:t>(</m:t>
+        </m:r>
+        <m:r>
+          <m:rPr>
+            <m:sty m:val="p"/>
+          </m:rPr>
+          <m:t>−</m:t>
+        </m:r>
+        <m:r>
+          <m:t>5</m:t>
+        </m:r>
+        <m:r>
+          <m:rPr>
+            <m:sty m:val="p"/>
+          </m:rPr>
+          <m:t>,</m:t>
+        </m:r>
+        <m:r>
+          <m:rPr>
+            <m:sty m:val="p"/>
+          </m:rPr>
+          <m:t>−</m:t>
+        </m:r>
+        <m:r>
+          <m:t>2</m:t>
+        </m:r>
+        <m:r>
+          <m:rPr>
+            <m:sty m:val="p"/>
+          </m:rPr>
+          <m:t>,</m:t>
+        </m:r>
+        <m:r>
+          <m:t>11</m:t>
+        </m:r>
+        <m:r>
+          <m:rPr>
+            <m:sty m:val="p"/>
+          </m:rPr>
+          <m:t>)</m:t>
+        </m:r>
       </m:oMath>
       <w:r>
         <w:t xml:space="preserve">.</w:t>
@@ -3269,8 +3283,8 @@
         </w:pict>
       </w:r>
     </w:p>
-    <w:bookmarkEnd w:id="24"/>
-    <w:bookmarkStart w:id="26" w:name="version-history-and-licensing"/>
+    <w:bookmarkEnd w:id="13"/>
+    <w:bookmarkStart w:id="15" w:name="version-history-and-licensing"/>
     <w:p>
       <w:pPr>
         <w:pStyle w:val="Heading2"/>
@@ -3303,7 +3317,7 @@
       <w:pPr>
         <w:pStyle w:val="FirstParagraph"/>
       </w:pPr>
-      <w:hyperlink r:id="rId25">
+      <w:hyperlink r:id="rId14">
         <w:r>
           <w:rPr>
             <w:rStyle w:val="Hyperlink"/>
@@ -3312,7 +3326,7 @@
         </w:r>
       </w:hyperlink>
     </w:p>
-    <w:bookmarkEnd w:id="26"/>
+    <w:bookmarkEnd w:id="15"/>
     <w:sectPr>
       <w:pgSz w:h="15840" w:w="12240"/>
       <w:pgMar w:bottom="1440" w:footer="720" w:gutter="0" w:header="720" w:left="1440" w:right="1440" w:top="1440"/>

</xml_diff>